<commit_message>
Paulin: restore 'polities'; Motion: ellipses; note ellipsis preference
Co-Authored-By: Claude Sonnet 5.5 <noreply@anthropic.com>
</commit_message>
<xml_diff>
--- a/content-src/docx/R TLS 1994 04 08 Motion price.docx
+++ b/content-src/docx/R TLS 1994 04 08 Motion price.docx
@@ -84,7 +84,7 @@
     </w:p>
     <w:p>
       <w:r>
-        <w:t xml:space="preserve">That conflict can cause such dispossession, can strike at the heart of the home against which individuals define themselves, is again handled in two distinct ways. The first posits a more suspect, lapsarian narrative, in which something can be, and has been, lost, whether in the Edenic references to his parents stepping out, or the starker observations of the nomadic, clutching their keepsakes; “they love each other . . . they have to since they lost so much at once; / each other’s lives are all they’ve got left”. Sequences beginning “it starts like this”, plotting the transformation of labour into luxury or the development of a dangerous civilization, emphasize such a faith. At times these meditations seem too huge to depend on the assault which ostensibly triggers them; one is reminded of Geoffrey Hill’s carefully ambiguous lines in “September Song”: “I have made / an elegy for myself it / is true”.</w:t>
+        <w:t xml:space="preserve">That conflict can cause such dispossession, can strike at the heart of the home against which individuals define themselves, is again handled in two distinct ways. The first posits a more suspect, lapsarian narrative, in which something can be, and has been, lost, whether in the Edenic references to his parents stepping out, or the starker observations of the nomadic, clutching their keepsakes; “they love each other… they have to since they lost so much at once; / each other’s lives are all they’ve got left”. Sequences beginning “it starts like this”, plotting the transformation of labour into luxury or the development of a dangerous civilization, emphasize such a faith. At times these meditations seem too huge to depend on the assault which ostensibly triggers them; one is reminded of Geoffrey Hill’s carefully ambiguous lines in “September Song”: “I have made / an elegy for myself it / is true”.</w:t>
       </w:r>
     </w:p>
     <w:p>
@@ -98,7 +98,7 @@
         <w:t xml:space="preserve">parents, women, streets, parks</w:t>
       </w:r>
       <w:r>
-        <w:t xml:space="preserve"> . . . just lie there. / They never become a story.” This failure of a “big language”, dreamed of in the apparent success of the 1945 peace, is indicated elsewhere by the juddering collapse of narrative into skeletal tercets, stripped of all but their rhythms and final rhymes, suggestive of any story or none at all.</w:t>
+        <w:t xml:space="preserve">… just lie there. / They never become a story.” This failure of a “big language”, dreamed of in the apparent success of the 1945 peace, is indicated elsewhere by the juddering collapse of narrative into skeletal tercets, stripped of all but their rhythms and final rhymes, suggestive of any story or none at all.</w:t>
       </w:r>
     </w:p>
     <w:p>

</xml_diff>